<commit_message>
Finalize requirements review and update Appendix B
</commit_message>
<xml_diff>
--- a/report/05_Requirements_Review.docx
+++ b/report/05_Requirements_Review.docx
@@ -15,8 +15,28 @@
         <w:pStyle w:val="Heading2"/>
       </w:pPr>
       <w:r>
-        <w:t>Final requirement Status</w:t>
-      </w:r>
+        <w:t>Final Requirements Status</w:t>
+      </w:r>
+    </w:p>
+    <w:p>
+      <w:r>
+        <w:t>The team reviewed each original business requirement against the final database design, SQL implementation, sample data, and query set. Figure 11 shows the final status and implementation evidence for BR-01 through BR-18. All requirements were completed within the approved project scope. The detailed final requirements register is provided in Appendix B.</w:t>
+      </w:r>
+    </w:p>
+    <w:p>
+      <w:proofErr w:type="gramStart"/>
+      <w:r>
+        <w:t>Figure 11.</w:t>
+      </w:r>
+      <w:proofErr w:type="gramEnd"/>
+      <w:r>
+        <w:t xml:space="preserve"> </w:t>
+      </w:r>
+      <w:proofErr w:type="gramStart"/>
+      <w:r>
+        <w:t>Final implementation status and supporting evidence for the Domino’s online-ordering business requirements.</w:t>
+      </w:r>
+      <w:proofErr w:type="gramEnd"/>
     </w:p>
     <w:p>
       <w:r>
@@ -25,9 +45,9 @@
         </w:rPr>
         <w:drawing>
           <wp:inline distT="0" distB="0" distL="0" distR="0">
-            <wp:extent cx="5943600" cy="1393997"/>
+            <wp:extent cx="5943600" cy="3423920"/>
             <wp:effectExtent l="19050" t="0" r="0" b="0"/>
-            <wp:docPr id="1" name="Picture 1"/>
+            <wp:docPr id="2" name="Picture 1" descr="Requirements_Review.png"/>
             <wp:cNvGraphicFramePr>
               <a:graphicFrameLocks xmlns:a="http://schemas.openxmlformats.org/drawingml/2006/main" noChangeAspect="1"/>
             </wp:cNvGraphicFramePr>
@@ -35,33 +55,23 @@
               <a:graphicData uri="http://schemas.openxmlformats.org/drawingml/2006/picture">
                 <pic:pic xmlns:pic="http://schemas.openxmlformats.org/drawingml/2006/picture">
                   <pic:nvPicPr>
-                    <pic:cNvPr id="0" name="Picture 1"/>
-                    <pic:cNvPicPr>
-                      <a:picLocks noChangeAspect="1" noChangeArrowheads="1"/>
-                    </pic:cNvPicPr>
+                    <pic:cNvPr id="0" name="Requirements_Review.png"/>
+                    <pic:cNvPicPr/>
                   </pic:nvPicPr>
                   <pic:blipFill>
                     <a:blip r:embed="rId4"/>
-                    <a:srcRect/>
                     <a:stretch>
                       <a:fillRect/>
                     </a:stretch>
                   </pic:blipFill>
-                  <pic:spPr bwMode="auto">
+                  <pic:spPr>
                     <a:xfrm>
                       <a:off x="0" y="0"/>
-                      <a:ext cx="5943600" cy="1393997"/>
+                      <a:ext cx="5943600" cy="3423920"/>
                     </a:xfrm>
                     <a:prstGeom prst="rect">
                       <a:avLst/>
                     </a:prstGeom>
-                    <a:noFill/>
-                    <a:ln w="9525">
-                      <a:noFill/>
-                      <a:miter lim="800000"/>
-                      <a:headEnd/>
-                      <a:tailEnd/>
-                    </a:ln>
                   </pic:spPr>
                 </pic:pic>
               </a:graphicData>
@@ -72,7 +82,7 @@
     </w:p>
     <w:p>
       <w:r>
-        <w:t>All documented requirements were completed in Version 1.3. Appendix A provides the detailed requirement-by-requirement traceability matrix.</w:t>
+        <w:t>The final build supports the complete customer-ordering process, including registered and guest orders, addresses, store fulfillment, menu configuration, product variations, customizations, payment attempts, promotions, loyalty activity, and order-status history. It also implements the proposed Meal Club venture through subscription plans, customer subscriptions, and subscription-benefit events. The query set demonstrates reporting across sales, products, customizations, stores, promotions, customers, fulfillment methods, loyalty activity, and Meal Club benefit usage.</w:t>
       </w:r>
     </w:p>
     <w:p>
@@ -85,12 +95,13 @@
     </w:p>
     <w:p>
       <w:r>
-        <w:t>Several capabilities are outside this project’s scope. These include real-time driver tracking, inventory management, recurring subscription billing, refund processing, employee scheduling, and third-party delivery-platform integration.</w:t>
-      </w:r>
-    </w:p>
-    <w:p>
-      <w:r>
-        <w:t>These features would require additional tables, business rules, and data sources. Future work should also add application-level access controls, audit logging, and a customer-facing ordering interface.</w:t>
+        <w:t>Several capabilities remain outside the approved project scope. These include real-time driver tracking, inventory management, recurring subscription billing, refund processing, employee scheduling, and third-party delivery-platform integration.</w:t>
+      </w:r>
+    </w:p>
+    <w:p/>
+    <w:p>
+      <w:r>
+        <w:t>These capabilities would require additional tables, business rules, and data sources. Future work should also add application-level access controls, audit logging, and a customer-facing ordering interface.</w:t>
       </w:r>
     </w:p>
     <w:sectPr>

</xml_diff>